<commit_message>
Handle company vs physical person in contract template
Use single ${TENANT_INFO} placeholder that adapts based on tenant type:
- Person: Jméno, Nar., Bytem, Email
- Company: Společnost + zastoupena, IČO, DIČ, Sídlem, Email

Make address always required (needed for contract), birth date only
required for physical persons. Move address fields outside company
toggle in order form. Update signing page to show correct tenant info.

Co-Authored-By: Claude Opus 4.6 (1M context) <noreply@anthropic.com>
</commit_message>
<xml_diff>
--- a/templates/documents/contract_template.docx
+++ b/templates/documents/contract_template.docx
@@ -360,182 +360,14 @@
       <w:pPr>
         <w:spacing w:after="0"/>
         <w:rPr>
-          <w:b/>
-          <w:bCs/>
           <w:szCs w:val="24"/>
         </w:rPr>
       </w:pPr>
       <w:r>
         <w:rPr>
-          <w:b/>
-          <w:bCs/>
           <w:szCs w:val="24"/>
         </w:rPr>
-        <w:t>Jméno:</w:t>
-      </w:r>
-      <w:r>
-        <w:rPr>
-          <w:b/>
-          <w:bCs/>
-          <w:szCs w:val="24"/>
-        </w:rPr>
-        <w:tab/>
-      </w:r>
-      <w:r>
-        <w:rPr>
-          <w:b/>
-          <w:bCs/>
-          <w:szCs w:val="24"/>
-        </w:rPr>
-        <w:tab/>
-      </w:r>
-      <w:r>
-        <w:rPr>
-          <w:b/>
-          <w:bCs/>
-          <w:szCs w:val="24"/>
-        </w:rPr>
-        <w:t>${TENANT_NAME}</w:t>
-      </w:r>
-    </w:p>
-    <w:p>
-      <w:pPr>
-        <w:spacing w:after="0"/>
-        <w:rPr>
-          <w:szCs w:val="24"/>
-        </w:rPr>
-      </w:pPr>
-      <w:r>
-        <w:rPr>
-          <w:szCs w:val="24"/>
-        </w:rPr>
-        <w:t>Nar.</w:t>
-      </w:r>
-      <w:r>
-        <w:rPr>
-          <w:szCs w:val="24"/>
-        </w:rPr>
-        <w:tab/>
-      </w:r>
-      <w:r>
-        <w:rPr>
-          <w:szCs w:val="24"/>
-        </w:rPr>
-        <w:tab/>
-      </w:r>
-      <w:r>
-        <w:rPr>
-          <w:szCs w:val="24"/>
-        </w:rPr>
-        <w:tab/>
-      </w:r>
-      <w:r>
-        <w:rPr>
-          <w:szCs w:val="24"/>
-        </w:rPr>
-        <w:t>${TENANT_BIRTH_DATE}</w:t>
-      </w:r>
-    </w:p>
-    <w:p>
-      <w:pPr>
-        <w:spacing w:after="0"/>
-        <w:rPr>
-          <w:szCs w:val="24"/>
-        </w:rPr>
-      </w:pPr>
-      <w:r>
-        <w:rPr>
-          <w:szCs w:val="24"/>
-        </w:rPr>
-        <w:t>Bytem:</w:t>
-      </w:r>
-      <w:r>
-        <w:rPr>
-          <w:szCs w:val="24"/>
-        </w:rPr>
-        <w:tab/>
-      </w:r>
-      <w:r>
-        <w:rPr>
-          <w:szCs w:val="24"/>
-        </w:rPr>
-        <w:tab/>
-      </w:r>
-      <w:r>
-        <w:rPr>
-          <w:szCs w:val="24"/>
-        </w:rPr>
-        <w:tab/>
-      </w:r>
-      <w:r>
-        <w:rPr>
-          <w:szCs w:val="24"/>
-        </w:rPr>
-        <w:tab/>
-      </w:r>
-      <w:r>
-        <w:rPr>
-          <w:szCs w:val="24"/>
-        </w:rPr>
-        <w:t>${TENANT_ADDRESS}</w:t>
-      </w:r>
-    </w:p>
-    <w:p>
-      <w:pPr>
-        <w:spacing w:after="0"/>
-        <w:rPr>
-          <w:b/>
-          <w:bCs/>
-          <w:szCs w:val="24"/>
-        </w:rPr>
-      </w:pPr>
-      <w:r>
-        <w:rPr>
-          <w:b/>
-          <w:bCs/>
-          <w:szCs w:val="24"/>
-        </w:rPr>
-        <w:t>Email:</w:t>
-      </w:r>
-      <w:r>
-        <w:rPr>
-          <w:b/>
-          <w:bCs/>
-          <w:szCs w:val="24"/>
-        </w:rPr>
-        <w:tab/>
-      </w:r>
-      <w:r>
-        <w:rPr>
-          <w:b/>
-          <w:bCs/>
-          <w:szCs w:val="24"/>
-        </w:rPr>
-        <w:tab/>
-      </w:r>
-      <w:r>
-        <w:rPr>
-          <w:b/>
-          <w:bCs/>
-          <w:szCs w:val="24"/>
-        </w:rPr>
-        <w:tab/>
-      </w:r>
-      <w:r>
-        <w:rPr>
-          <w:b/>
-          <w:bCs/>
-          <w:szCs w:val="24"/>
-        </w:rPr>
-        <w:tab/>
-      </w:r>
-      <w:r>
-        <w:rPr>
-          <w:b/>
-          <w:bCs/>
-          <w:szCs w:val="24"/>
-        </w:rPr>
-        <w:t>${TENANT_EMAIL}</w:t>
+        <w:t>${TENANT_INFO}</w:t>
       </w:r>
     </w:p>
     <w:p>

</xml_diff>

<commit_message>
Add remaining pre-existing changes: contract template, email improvements, recurring payment cancellation
Co-Authored-By: Claude Opus 4.6 (1M context) <noreply@anthropic.com>
</commit_message>
<xml_diff>
--- a/templates/documents/contract_template.docx
+++ b/templates/documents/contract_template.docx
@@ -1956,6 +1956,12 @@
                 <w:szCs w:val="24"/>
               </w:rPr>
             </w:pPr>
+            <w:r>
+              <w:rPr>
+                <w:szCs w:val="24"/>
+              </w:rPr>
+              <w:t>V ${SIGNING_PLACE} dne ${SIGNING_DATE}</w:t>
+            </w:r>
           </w:p>
           <w:p>
             <w:pPr>

</xml_diff>

<commit_message>
Fix missing tenant data in contract; send PDF instead of DOCX
- Add phone to contract TENANT_INFO (was silently omitted for both person
  and company variants).
- Persist billing address and company info on the User during order
  placement — GetOrCreateUserByEmailHandler dropped these fields, so
  first-time customers ended up with "Bytem: -" in their contract.
  Address is always synced; company info only when invoiceToCompany is
  checked, to preserve a returning customer's saved IČO/DIČ when they
  toggle the option off for one order.
- Make placeholder runs in contract_template.docx bold so substituted
  values stand out from boilerplate.
- Convert contract DOCX to PDF for both email attachments
  (smlouva-*.pdf), with DOCX fallback if soffice is unavailable.
- Tighten phone validation on the order form (required, digit format).
- Refresh templates/documents/README.md to match the placeholders the
  generator actually fills.
</commit_message>
<xml_diff>
--- a/templates/documents/contract_template.docx
+++ b/templates/documents/contract_template.docx
@@ -365,6 +365,8 @@
       </w:pPr>
       <w:r>
         <w:rPr>
+          <w:bCs/>
+          <w:b/>
           <w:szCs w:val="24"/>
         </w:rPr>
         <w:t>${TENANT_INFO}</w:t>
@@ -404,6 +406,8 @@
       </w:pPr>
       <w:r>
         <w:rPr>
+          <w:bCs/>
+          <w:b/>
           <w:sz w:val="28"/>
         </w:rPr>
         <w:t>SMLOUVA O NÁJMU Č. ${CONTRACT_NUMBER}</w:t>
@@ -532,6 +536,8 @@
       </w:pPr>
       <w:r>
         <w:rPr>
+          <w:bCs/>
+          <w:b/>
           <w:szCs w:val="20"/>
         </w:rPr>
         <w:t>${STORAGE_DESCRIPTION}</w:t>
@@ -777,6 +783,8 @@
       </w:pPr>
       <w:r>
         <w:rPr>
+          <w:bCs/>
+          <w:b/>
           <w:szCs w:val="20"/>
         </w:rPr>
         <w:t>${RENTAL_DURATION_TEXT}</w:t>
@@ -1849,6 +1857,8 @@
             </w:pPr>
             <w:r>
               <w:rPr>
+                <w:bCs/>
+                <w:b/>
                 <w:szCs w:val="24"/>
               </w:rPr>
               <w:t>V ${CONTRACT_CITY} dne ${CONTRACT_DATE}</w:t>
@@ -1958,6 +1968,8 @@
             </w:pPr>
             <w:r>
               <w:rPr>
+                <w:bCs/>
+                <w:b/>
                 <w:szCs w:val="24"/>
               </w:rPr>
               <w:t>V ${SIGNING_PLACE} dne ${SIGNING_DATE}</w:t>

</xml_diff>